<commit_message>
add 4 tur for bwt
</commit_message>
<xml_diff>
--- a/src/templates/Angebot-BWT.docx
+++ b/src/templates/Angebot-BWT.docx
@@ -1646,7 +1646,7 @@
             <w:pPr>
               <w:pBdr/>
               <w:pStyle w:val="Body Text"/>
-              <w:spacing w:before="100" w:beforeAutospacing="true" w:after="0" w:afterAutospacing="false" w:line="240" w:lineRule="auto"/>
+              <w:spacing w:before="100" w:beforeAutospacing="true" w:after="0" w:afterAutospacing="false" w:line="276" w:lineRule="auto"/>
               <w:widowControl w:val="0"/>
               <w:ind w:left="0" w:right="0"/>
               <w:jc w:val="left"/>
@@ -1665,14 +1665,6 @@
                 <w:sz w:val="20"/>
               </w:rPr>
               <w:t xml:space="preserve">Zusatliche Artikel</w:t>
-            </w:r>
-            <w:r>
-              <w:rPr>
-                <w:rFonts w:ascii="Arial" w:eastAsia="Arial" w:hAnsi="Arial" w:cs="Arial"/>
-                <w:b/>
-                <w:sz w:val="20"/>
-              </w:rPr>
-              <w:br/>
             </w:r>
             <w:r>
               <w:rPr/>

</xml_diff>

<commit_message>
Move bwt offer desc below sebkostenanteil
</commit_message>
<xml_diff>
--- a/src/templates/Angebot-BWT.docx
+++ b/src/templates/Angebot-BWT.docx
@@ -63,9 +63,9 @@
         <w:tblLook w:val="04a0" w:noVBand="1" w:noHBand="0" w:lastColumn="0" w:firstColumn="1" w:lastRow="0" w:firstRow="1"/>
       </w:tblPr>
       <w:tblGrid>
-        <w:gridCol w:w="4800"/>
+        <w:gridCol w:w="4799"/>
         <w:gridCol w:w="2268"/>
-        <w:gridCol w:w="2967"/>
+        <w:gridCol w:w="2968"/>
       </w:tblGrid>
       <w:tr>
         <w:trPr>
@@ -73,7 +73,7 @@
         </w:trPr>
         <w:tc>
           <w:tcPr>
-            <w:tcW w:w="4800" w:type="dxa"/>
+            <w:tcW w:w="4799" w:type="dxa"/>
             <w:tcBorders>
               <w:top w:val="single" w:sz="8" w:space="0" w:color="FFFFFF"/>
               <w:left w:val="single" w:sz="8" w:space="0" w:color="FFFFFF"/>
@@ -284,7 +284,7 @@
         </w:tc>
         <w:tc>
           <w:tcPr>
-            <w:tcW w:w="2967" w:type="dxa"/>
+            <w:tcW w:w="2968" w:type="dxa"/>
             <w:tcBorders>
               <w:top w:val="single" w:sz="8" w:space="0" w:color="FFFFFF"/>
               <w:left w:val="single" w:sz="8" w:space="0" w:color="FFFFFF"/>
@@ -521,7 +521,7 @@
         </w:trPr>
         <w:tc>
           <w:tcPr>
-            <w:tcW w:w="4800" w:type="dxa"/>
+            <w:tcW w:w="4799" w:type="dxa"/>
             <w:tcBorders>
               <w:top w:val="single" w:sz="8" w:space="0" w:color="FFFFFF"/>
               <w:left w:val="single" w:sz="8" w:space="0" w:color="FFFFFF"/>
@@ -556,7 +556,7 @@
         </w:tc>
         <w:tc>
           <w:tcPr>
-            <w:tcW w:w="5235" w:type="dxa"/>
+            <w:tcW w:w="5236" w:type="dxa"/>
             <w:gridSpan w:val="2"/>
             <w:tcBorders>
               <w:top w:val="single" w:sz="8" w:space="0" w:color="FFFFFF"/>
@@ -687,7 +687,7 @@
           <w:color w:val="070707"/>
           <w:lang w:val="de-DE"/>
         </w:rPr>
-        <w:t>vielen Dank für Ihre Anfrage und Ihr damit verbundenes Interesse.{#BwtSteelNoteEnabled}</w:t>
+        <w:t>vielen Dank für Ihre Anfrage und Ihr damit verbundenes Interesse.</w:t>
       </w:r>
     </w:p>
     <w:p>
@@ -701,50 +701,6 @@
           <w:lang w:val="de-DE"/>
         </w:rPr>
       </w:pPr>
-      <w:r>
-        <w:rPr>
-          <w:rFonts w:eastAsia="Open Sans" w:cs="Open Sans" w:ascii="Open Sans" w:hAnsi="Open Sans"/>
-          <w:color w:val="070707"/>
-          <w:lang w:val="de-DE"/>
-        </w:rPr>
-        <w:t>{BwtSteelNote}</w:t>
-      </w:r>
-    </w:p>
-    <w:p>
-      <w:pPr>
-        <w:pStyle w:val="Normal"/>
-        <w:spacing w:before="1" w:after="0"/>
-        <w:ind w:hanging="5" w:left="125" w:right="-89"/>
-        <w:rPr>
-          <w:rFonts w:ascii="Open Sans" w:hAnsi="Open Sans"/>
-        </w:rPr>
-      </w:pPr>
-      <w:r>
-        <w:rPr>
-          <w:rFonts w:eastAsia="Open Sans" w:cs="Open Sans" w:ascii="Open Sans" w:hAnsi="Open Sans"/>
-          <w:color w:val="070707"/>
-          <w:lang w:val="de-DE"/>
-        </w:rPr>
-        <w:t>{/BwtSteelNoteEnabled}{#BwtProxyNoteEnabled}{BwtProxyNote}</w:t>
-      </w:r>
-    </w:p>
-    <w:p>
-      <w:pPr>
-        <w:pStyle w:val="Normal"/>
-        <w:spacing w:before="1" w:after="0"/>
-        <w:ind w:hanging="5" w:left="125" w:right="-89"/>
-        <w:rPr>
-          <w:rFonts w:ascii="Open Sans" w:hAnsi="Open Sans"/>
-        </w:rPr>
-      </w:pPr>
-      <w:r>
-        <w:rPr>
-          <w:rFonts w:eastAsia="Open Sans" w:cs="Open Sans" w:ascii="Open Sans" w:hAnsi="Open Sans"/>
-          <w:color w:val="070707"/>
-          <w:lang w:val="de-DE"/>
-        </w:rPr>
-        <w:t>{/BwtProxyNoteEnabled}</w:t>
-      </w:r>
       <w:r>
         <w:rPr>
           <w:rFonts w:eastAsia="Open Sans" w:cs="Open Sans" w:ascii="Open Sans" w:hAnsi="Open Sans"/>
@@ -796,9 +752,9 @@
       <w:tblGrid>
         <w:gridCol w:w="510"/>
         <w:gridCol w:w="885"/>
-        <w:gridCol w:w="5856"/>
+        <w:gridCol w:w="5855"/>
         <w:gridCol w:w="1440"/>
-        <w:gridCol w:w="1254"/>
+        <w:gridCol w:w="1255"/>
       </w:tblGrid>
       <w:tr>
         <w:trPr>
@@ -872,7 +828,7 @@
         </w:tc>
         <w:tc>
           <w:tcPr>
-            <w:tcW w:w="5856" w:type="dxa"/>
+            <w:tcW w:w="5855" w:type="dxa"/>
             <w:tcBorders/>
             <w:shd w:color="auto" w:fill="CCCCCC" w:val="clear"/>
           </w:tcPr>
@@ -931,7 +887,7 @@
         </w:tc>
         <w:tc>
           <w:tcPr>
-            <w:tcW w:w="1254" w:type="dxa"/>
+            <w:tcW w:w="1255" w:type="dxa"/>
             <w:tcBorders/>
             <w:shd w:color="auto" w:fill="CCCCCC" w:val="clear"/>
           </w:tcPr>
@@ -1026,7 +982,7 @@
         </w:tc>
         <w:tc>
           <w:tcPr>
-            <w:tcW w:w="5856" w:type="dxa"/>
+            <w:tcW w:w="5855" w:type="dxa"/>
             <w:tcBorders/>
             <w:shd w:color="auto" w:fill="FFFFFF" w:val="clear"/>
           </w:tcPr>
@@ -1090,7 +1046,7 @@
         </w:tc>
         <w:tc>
           <w:tcPr>
-            <w:tcW w:w="1254" w:type="dxa"/>
+            <w:tcW w:w="1255" w:type="dxa"/>
             <w:tcBorders/>
             <w:shd w:color="auto" w:fill="FFFFFF" w:val="clear"/>
           </w:tcPr>
@@ -1208,7 +1164,7 @@
         </w:tc>
         <w:tc>
           <w:tcPr>
-            <w:tcW w:w="5856" w:type="dxa"/>
+            <w:tcW w:w="5855" w:type="dxa"/>
             <w:tcBorders/>
             <w:shd w:color="auto" w:fill="FFFFFF" w:val="clear"/>
             <w:tcMar>
@@ -1496,7 +1452,7 @@
         </w:tc>
         <w:tc>
           <w:tcPr>
-            <w:tcW w:w="1254" w:type="dxa"/>
+            <w:tcW w:w="1255" w:type="dxa"/>
             <w:tcBorders/>
             <w:shd w:color="auto" w:fill="FFFFFF" w:val="clear"/>
             <w:tcMar>
@@ -1570,9 +1526,9 @@
       <w:tblGrid>
         <w:gridCol w:w="510"/>
         <w:gridCol w:w="885"/>
-        <w:gridCol w:w="5856"/>
+        <w:gridCol w:w="5855"/>
         <w:gridCol w:w="1440"/>
-        <w:gridCol w:w="1254"/>
+        <w:gridCol w:w="1255"/>
       </w:tblGrid>
       <w:tr>
         <w:trPr>
@@ -1641,7 +1597,7 @@
         </w:tc>
         <w:tc>
           <w:tcPr>
-            <w:tcW w:w="5856" w:type="dxa"/>
+            <w:tcW w:w="5855" w:type="dxa"/>
             <w:tcBorders/>
             <w:shd w:color="auto" w:fill="FFFFFF" w:val="clear"/>
           </w:tcPr>
@@ -1712,7 +1668,7 @@
         </w:tc>
         <w:tc>
           <w:tcPr>
-            <w:tcW w:w="1254" w:type="dxa"/>
+            <w:tcW w:w="1255" w:type="dxa"/>
             <w:tcBorders/>
             <w:shd w:color="auto" w:fill="FFFFFF" w:val="clear"/>
             <w:tcMar>
@@ -1801,7 +1757,7 @@
         </w:tc>
         <w:tc>
           <w:tcPr>
-            <w:tcW w:w="5856" w:type="dxa"/>
+            <w:tcW w:w="5855" w:type="dxa"/>
             <w:tcBorders/>
             <w:shd w:color="auto" w:fill="FFFFFF" w:val="clear"/>
           </w:tcPr>
@@ -1992,7 +1948,7 @@
         </w:tc>
         <w:tc>
           <w:tcPr>
-            <w:tcW w:w="1254" w:type="dxa"/>
+            <w:tcW w:w="1255" w:type="dxa"/>
             <w:tcBorders/>
             <w:shd w:color="auto" w:fill="FFFFFF" w:val="clear"/>
             <w:vAlign w:val="center"/>
@@ -2089,7 +2045,7 @@
         </w:tc>
         <w:tc>
           <w:tcPr>
-            <w:tcW w:w="5856" w:type="dxa"/>
+            <w:tcW w:w="5855" w:type="dxa"/>
             <w:tcBorders/>
             <w:shd w:color="auto" w:fill="FFFFFF" w:val="clear"/>
           </w:tcPr>
@@ -2180,7 +2136,7 @@
         </w:tc>
         <w:tc>
           <w:tcPr>
-            <w:tcW w:w="1254" w:type="dxa"/>
+            <w:tcW w:w="1255" w:type="dxa"/>
             <w:tcBorders/>
             <w:shd w:color="auto" w:fill="FFFFFF" w:val="clear"/>
           </w:tcPr>
@@ -2584,15 +2540,7 @@
           <w:color w:val="030303"/>
           <w:lang w:val="de-DE"/>
         </w:rPr>
-        <w:t>HINWEIS</w:t>
-      </w:r>
-      <w:r>
-        <w:rPr>
-          <w:rFonts w:eastAsia="Open Sans Semibold" w:cs="Open Sans Semibold" w:ascii="Open Sans Semibold" w:hAnsi="Open Sans Semibold"/>
-          <w:color w:val="030303"/>
-          <w:lang w:val="de-DE"/>
-        </w:rPr>
-        <w:t>:</w:t>
+        <w:t>HINWEIS:</w:t>
       </w:r>
       <w:r>
         <w:rPr>
@@ -2716,6 +2664,77 @@
           <w:lang w:val="de-DE"/>
         </w:rPr>
         <w:t>{/IsTitle}{^IsTitle}{Text}{/IsTitle}{/SelfPayLines}</w:t>
+      </w:r>
+    </w:p>
+    <w:p>
+      <w:pPr>
+        <w:pStyle w:val="Normal"/>
+        <w:spacing w:before="1" w:after="0"/>
+        <w:ind w:hanging="5" w:left="125" w:right="-89"/>
+        <w:rPr>
+          <w:rFonts w:ascii="Open Sans" w:hAnsi="Open Sans"/>
+        </w:rPr>
+      </w:pPr>
+      <w:r>
+        <w:rPr>
+          <w:rFonts w:eastAsia="Open Sans" w:cs="Open Sans" w:ascii="Open Sans" w:hAnsi="Open Sans"/>
+          <w:color w:val="070707"/>
+          <w:lang w:val="de-DE"/>
+        </w:rPr>
+        <w:t>{#BwtSteelNoteEnabled}</w:t>
+      </w:r>
+    </w:p>
+    <w:p>
+      <w:pPr>
+        <w:pStyle w:val="Normal"/>
+        <w:spacing w:before="1" w:after="0"/>
+        <w:ind w:hanging="5" w:left="125" w:right="-89"/>
+        <w:rPr>
+          <w:rFonts w:ascii="Open Sans" w:hAnsi="Open Sans"/>
+        </w:rPr>
+      </w:pPr>
+      <w:r>
+        <w:rPr>
+          <w:rFonts w:eastAsia="Open Sans" w:cs="Open Sans" w:ascii="Open Sans" w:hAnsi="Open Sans"/>
+          <w:color w:val="070707"/>
+          <w:lang w:val="de-DE"/>
+        </w:rPr>
+        <w:t>{BwtSteelNote}</w:t>
+      </w:r>
+    </w:p>
+    <w:p>
+      <w:pPr>
+        <w:pStyle w:val="Normal"/>
+        <w:spacing w:before="1" w:after="0"/>
+        <w:ind w:hanging="5" w:left="125" w:right="-89"/>
+        <w:rPr>
+          <w:rFonts w:ascii="Open Sans" w:hAnsi="Open Sans"/>
+        </w:rPr>
+      </w:pPr>
+      <w:r>
+        <w:rPr>
+          <w:rFonts w:eastAsia="Open Sans" w:cs="Open Sans" w:ascii="Open Sans" w:hAnsi="Open Sans"/>
+          <w:color w:val="070707"/>
+          <w:lang w:val="de-DE"/>
+        </w:rPr>
+        <w:t>{/BwtSteelNoteEnabled}{#BwtProxyNoteEnabled}{BwtProxyNote}</w:t>
+      </w:r>
+    </w:p>
+    <w:p>
+      <w:pPr>
+        <w:pStyle w:val="Normal"/>
+        <w:spacing w:before="1" w:after="0"/>
+        <w:ind w:hanging="5" w:left="125" w:right="-89"/>
+        <w:rPr>
+          <w:rFonts w:ascii="Open Sans" w:hAnsi="Open Sans"/>
+        </w:rPr>
+      </w:pPr>
+      <w:r>
+        <w:rPr>
+          <w:rFonts w:ascii="Open Sans" w:hAnsi="Open Sans"/>
+          <w:color w:val="070707"/>
+        </w:rPr>
+        <w:t>{/BwtProxyNoteEnabled}</w:t>
       </w:r>
     </w:p>
     <w:p>
@@ -3536,7 +3555,7 @@
         <w:bCs w:val="false"/>
         <w:rFonts w:eastAsia="Open Sans" w:cs="Open Sans" w:ascii="Open Sans" w:hAnsi="Open Sans"/>
       </w:rPr>
-      <w:t>3</w:t>
+      <w:t>1</w:t>
     </w:r>
     <w:r>
       <w:rPr>
@@ -4116,7 +4135,7 @@
         <w:bCs w:val="false"/>
         <w:rFonts w:eastAsia="Open Sans" w:cs="Open Sans" w:ascii="Open Sans" w:hAnsi="Open Sans"/>
       </w:rPr>
-      <w:t>3</w:t>
+      <w:t>1</w:t>
     </w:r>
     <w:r>
       <w:rPr>

</xml_diff>